<commit_message>
Fix generator selection for misindexed permits
</commit_message>
<xml_diff>
--- a/reports/illinois-data-center-backup-power-report.docx
+++ b/reports/illinois-data-center-backup-power-report.docx
@@ -103,7 +103,7 @@
                 <w:color w:val="1E2933"/>
                 <w:sz w:val="22"/>
               </w:rPr>
-              <w:t>The listed data centers collectively resemble a large, geographically concentrated diesel-generation fleet. The selected regulatory inventories describe about 504 generators and at least 1.24 GW of standby nameplate capacity, even though the units are regulated facility by facility as emergency equipment.</w:t>
+              <w:t>The listed data centers collectively resemble a large, geographically concentrated diesel-generation fleet. The selected regulatory inventories describe about 515 generators and at least 1.26 GW of standby nameplate capacity, even though the units are regulated facility by facility as emergency equipment.</w:t>
             </w:r>
           </w:p>
         </w:tc>
@@ -153,7 +153,7 @@
                 <w:color w:val="FFFFFF"/>
                 <w:sz w:val="34"/>
               </w:rPr>
-              <w:t>504</w:t>
+              <w:t>515</w:t>
             </w:r>
           </w:p>
           <w:p>
@@ -195,7 +195,7 @@
                 <w:color w:val="17324D"/>
                 <w:sz w:val="34"/>
               </w:rPr>
-              <w:t>1.24 GW</w:t>
+              <w:t>1.26 GW</w:t>
             </w:r>
           </w:p>
           <w:p>
@@ -237,7 +237,7 @@
                 <w:color w:val="17324D"/>
                 <w:sz w:val="34"/>
               </w:rPr>
-              <w:t>20</w:t>
+              <w:t>21</w:t>
             </w:r>
           </w:p>
           <w:p>
@@ -279,7 +279,7 @@
                 <w:color w:val="17324D"/>
                 <w:sz w:val="34"/>
               </w:rPr>
-              <w:t>55%</w:t>
+              <w:t>54%</w:t>
             </w:r>
           </w:p>
           <w:p>
@@ -352,7 +352,7 @@
           <w:color w:val="1E2933"/>
           <w:sz w:val="22"/>
         </w:rPr>
-        <w:t xml:space="preserve"> Eight listed facilities with Elk Grove-area addresses account for 188 units and 518.5 MW - roughly 42% of documented capacity.</w:t>
+        <w:t xml:space="preserve"> Eight listed facilities with Elk Grove-area addresses account for 188 units and 518.5 MW - roughly 41% of documented capacity.</w:t>
       </w:r>
     </w:p>
     <w:p>
@@ -418,7 +418,7 @@
     </w:p>
     <w:p>
       <w:r>
-        <w:t>The strongest signal is cumulative scale. Across 20 unique Document Explorer records with a selected generator inventory, the workbook identifies 504 units and 1,238 MW of known electrical nameplate capacity. The shared ORD-01/ORD-02 record is counted once in these totals. Five records contain about 55% of the capacity.</w:t>
+        <w:t>The strongest signal is cumulative scale. Across 21 unique Document Explorer records with a selected generator inventory, the workbook identifies 515 units and 1,258 MW of known electrical nameplate capacity. The shared ORD-01/ORD-02 record is counted once in these totals. Five records contain about 54% of the capacity.</w:t>
       </w:r>
     </w:p>
     <w:p>
@@ -509,7 +509,7 @@
           <w:color w:val="1E2933"/>
           <w:sz w:val="22"/>
         </w:rPr>
-        <w:t>Edged's selected inventory contains 66 relatively small units totaling about 45 MW, while CyrusOne's 90-unit inventory totals 210 MW. Among the 499 units with a recovered kW rating, roughly 63% are rated at 2,500 kW or more. Capacity, engine technology, operating hours, and location are therefore more useful screening variables than unit count by itself.</w:t>
+        <w:t>Edged's selected inventory contains 66 relatively small units totaling about 45 MW, while CyrusOne's 90-unit inventory totals 210 MW. Among the 510 units with a recovered kW rating, roughly 61% are rated at 2,500 kW or more. Capacity, engine technology, operating hours, and location are therefore more useful screening variables than unit count by itself.</w:t>
       </w:r>
     </w:p>
     <w:p>
@@ -574,7 +574,7 @@
           <w:color w:val="66717C"/>
           <w:sz w:val="18"/>
         </w:rPr>
-        <w:t>Figure 2. Elk Grove-area facilities contain about 42% of selected capacity and 37% of selected units.</w:t>
+        <w:t>Figure 2. Elk Grove-area facilities contain about 41% of selected capacity and 37% of selected units.</w:t>
       </w:r>
     </w:p>
     <w:p>
@@ -612,7 +612,7 @@
     </w:p>
     <w:p>
       <w:r>
-        <w:t>The document set spans 2007 through May 2026, but recent activity is substantial: 22 of 73 final air-permit documents are dated 2024 or later. Eleven of the 20 selected regulatory inventories rely on permit evidence from 2024 or later. Any public-facing inventory should therefore be maintained as a time series rather than treated as a one-time census.</w:t>
+        <w:t>The document set spans 2007 through May 2026, but recent activity is substantial: 22 of 73 final air-permit documents are dated 2024 or later. 12 of the 21 selected regulatory inventories rely on permit evidence from 2024 or later. Any public-facing inventory should therefore be maintained as a time series rather than treated as a one-time census.</w:t>
       </w:r>
     </w:p>
     <w:p>
@@ -1270,7 +1270,7 @@
           <w:color w:val="1E2933"/>
           <w:sz w:val="22"/>
         </w:rPr>
-        <w:t>Only 2 of 38 selected generator-group records are marked Reviewed; the others remain OCR-derived and require confirmation.</w:t>
+        <w:t>Only 2 of 41 selected generator-group records are marked Reviewed; the others remain OCR-derived and require confirmation.</w:t>
       </w:r>
     </w:p>
     <w:p>
@@ -1300,7 +1300,7 @@
           <w:color w:val="1E2933"/>
           <w:sz w:val="22"/>
         </w:rPr>
-        <w:t>Five selected units lack a recovered kW rating and therefore contribute zero to the reported capacity total; 1.24 GW should be treated as a minimum known value.</w:t>
+        <w:t>5 selected units lack a recovered kW rating and therefore contribute zero to the reported capacity total; 1.26 GW should be treated as a minimum known value.</w:t>
       </w:r>
     </w:p>
     <w:p>

</xml_diff>